<commit_message>
Publish workspace from pulse-cluster @ 28c515f
Page built with --flat so pdf/ and the Markdown sources resolve from the
site root. Assets refreshed alongside it.
</commit_message>
<xml_diff>
--- a/pdf/PULSE-RTM-001_Traceability_Matrix.docx
+++ b/pdf/PULSE-RTM-001_Traceability_Matrix.docx
@@ -3691,7 +3691,22 @@
               <w:t xml:space="preserve"> </w:t>
             </w:r>
             <w:r>
-              <w:t xml:space="preserve">overlays; broker rejects out-of-catalogue values on set</w:t>
+              <w:t xml:space="preserve">overlays; broker rejects out-of-catalogue values on set; suite check</w:t>
+            </w:r>
+            <w:r>
+              <w:t xml:space="preserve"> </w:t>
+            </w:r>
+            <w:r>
+              <w:rPr>
+                <w:rStyle w:val="VerbatimChar"/>
+              </w:rPr>
+              <w:t xml:space="preserve">unit-sanity</w:t>
+            </w:r>
+            <w:r>
+              <w:t xml:space="preserve"> </w:t>
+            </w:r>
+            <w:r>
+              <w:t xml:space="preserve">catches a value published…</w:t>
             </w:r>
           </w:p>
         </w:tc>

</xml_diff>